<commit_message>
docs(version): 2.14.2938 — the Process Repository for everyone and for each Org; Org backup carries the Org's own repository; silent failures closed; product 2.13 -> 2.14 (schema 49 unchanged)
Release content (User Guide, Features drafts, Technical Notes): scripts/sql/publish-release-2-14-content.sql

Co-Authored-By: Claude Sonnet 5.5 <noreply@anthropic.com>
</commit_message>
<xml_diff>
--- a/competitors/diagramatix-vs-signavio-aris-primebpm-promapp-pega-appian-microsoft-2026-10-06.docx
+++ b/competitors/diagramatix-vs-signavio-aris-primebpm-promapp-pega-appian-microsoft-2026-10-06.docx
@@ -50,7 +50,7 @@
         <w:t xml:space="preserve"> </w:t>
       </w:r>
       <w:r>
-        <w:t xml:space="preserve">· October 2026 edition (adds Promapp / Nintex Process Manager) · product 2.13 · export SCHEMA_VERSION 49</w:t>
+        <w:t xml:space="preserve">· October 2026 edition (adds Promapp / Nintex Process Manager) · product 2.14 · export SCHEMA_VERSION 49</w:t>
       </w:r>
     </w:p>
     <w:p>
@@ -14678,7 +14678,7 @@
         <w:t xml:space="preserve"> </w:t>
       </w:r>
       <w:r>
-        <w:t xml:space="preserve">— current codebase, 24 September 2026: product 2.13, export SCHEMA_VERSION 49, nine notations.</w:t>
+        <w:t xml:space="preserve">— current codebase, 9 October 2026: product 2.14, export SCHEMA_VERSION 49, nine notations.</w:t>
       </w:r>
     </w:p>
     <w:p>

</xml_diff>